<commit_message>
Updated template to follow 2026 Rutgers common changes
</commit_message>
<xml_diff>
--- a/Report/Description.docx
+++ b/Report/Description.docx
@@ -4,7 +4,7 @@
   <w:body>
     <w:p>
       <w:pPr>
-        <w:pStyle w:val="Subtitle"/>
+        <w:pStyle w:val="Heading1"/>
       </w:pPr>
       <w:r>
         <w:t>Process Description</w:t>
@@ -20,50 +20,10 @@
         <w:t xml:space="preserve">Production process </w:t>
       </w:r>
       <w:r>
-        <w:t xml:space="preserve">focuses on extruded films for printing, signage, displays and security </w:t>
-      </w:r>
-      <w:proofErr w:type="spellStart"/>
-      <w:r>
-        <w:t>appkications</w:t>
-      </w:r>
-      <w:proofErr w:type="spellEnd"/>
-      <w:r>
-        <w:t>.</w:t>
+        <w:t>focuses on extruded films for printing, signage, displays and security appkications.</w:t>
       </w:r>
       <w:r>
-        <w:t xml:space="preserve"> Basic components </w:t>
-      </w:r>
-      <w:proofErr w:type="spellStart"/>
-      <w:r>
-        <w:t>tha</w:t>
-      </w:r>
-      <w:proofErr w:type="spellEnd"/>
-      <w:r>
-        <w:t xml:space="preserve"> make up aerosol are can, valve, actuator, and cap. Raw </w:t>
-      </w:r>
-      <w:proofErr w:type="spellStart"/>
-      <w:r>
-        <w:t>mateerials</w:t>
-      </w:r>
-      <w:proofErr w:type="spellEnd"/>
-      <w:r>
-        <w:t xml:space="preserve"> are water based or a solvent like alcohol. Purchase the components, they make the chemicals to fit into the can. Propellent also goes into the can. Delivered to specific warehouses depending on component. Trucks pick up materials and </w:t>
-      </w:r>
-      <w:proofErr w:type="spellStart"/>
-      <w:r>
-        <w:t>devliver</w:t>
-      </w:r>
-      <w:proofErr w:type="spellEnd"/>
-      <w:r>
-        <w:t xml:space="preserve"> to specific material where production happens. 5 Manufacturing buildings. 2 types of </w:t>
-      </w:r>
-      <w:proofErr w:type="spellStart"/>
-      <w:r>
-        <w:t>aersols</w:t>
-      </w:r>
-      <w:proofErr w:type="spellEnd"/>
-      <w:r>
-        <w:t xml:space="preserve"> made, one is conventional with flammable propellants or the other is bag on valve, which uses a </w:t>
+        <w:t xml:space="preserve"> Basic components tha make up aerosol are can, valve, actuator, and cap. Raw mateerials are water based or a solvent like alcohol. Purchase the components, they make the chemicals to fit into the can. Propellent also goes into the can. Delivered to specific warehouses depending on component. Trucks pick up materials and devliver to specific material where production happens. 5 Manufacturing buildings. 2 types of aersols made, one is conventional with flammable propellants or the other is bag on valve, which uses a </w:t>
       </w:r>
       <w:r>
         <w:t>compressed</w:t>
@@ -607,16 +567,34 @@
     </w:p>
     <w:p>
       <w:pPr>
-        <w:pStyle w:val="Subtitle"/>
+        <w:rPr>
+          <w:rFonts w:eastAsia="Cambria" w:cs="Cambria"/>
+          <w:b/>
+          <w:szCs w:val="22"/>
+        </w:rPr>
       </w:pPr>
       <w:r>
-        <w:t>Major Equipment</w:t>
+        <w:br w:type="page"/>
       </w:r>
     </w:p>
     <w:p>
       <w:pPr>
+        <w:pStyle w:val="Heading1"/>
+      </w:pPr>
+      <w:r>
+        <w:lastRenderedPageBreak/>
+        <w:t xml:space="preserve">Major </w:t>
+      </w:r>
+      <w:r>
+        <w:t xml:space="preserve">Energy Consuming </w:t>
+      </w:r>
+      <w:r>
+        <w:t>Equipment</w:t>
+      </w:r>
+    </w:p>
+    <w:p>
+      <w:pPr>
         <w:spacing w:after="120" w:line="360" w:lineRule="auto"/>
-        <w:ind w:firstLine="720"/>
       </w:pPr>
       <w:r>
         <w:t>The following is a table depicting the facility’s major energy-consuming equipment.</w:t>
@@ -931,6 +909,9 @@
               <w:jc w:val="center"/>
             </w:pPr>
             <w:r>
+              <w:t>5</w:t>
+            </w:r>
+            <w:r>
               <w:t>40</w:t>
             </w:r>
             <w:r>
@@ -1030,11 +1011,31 @@
     </w:p>
     <w:p>
       <w:pPr>
-        <w:pStyle w:val="Subtitle"/>
+        <w:rPr>
+          <w:rFonts w:eastAsia="Cambria" w:cs="Cambria"/>
+          <w:b/>
+          <w:szCs w:val="22"/>
+        </w:rPr>
+      </w:pPr>
+      <w:r>
+        <w:br w:type="page"/>
+      </w:r>
+    </w:p>
+    <w:p>
+      <w:pPr>
+        <w:pStyle w:val="Heading1"/>
       </w:pPr>
       <w:r>
         <w:lastRenderedPageBreak/>
-        <w:t>Current Best Practices</w:t>
+        <w:t>Best Practices</w:t>
+      </w:r>
+    </w:p>
+    <w:p>
+      <w:pPr>
+        <w:spacing w:line="360" w:lineRule="auto"/>
+      </w:pPr>
+      <w:r>
+        <w:t>The following best practices in energy conservation were observed during the visit and are encouraged to remain in action:</w:t>
       </w:r>
     </w:p>
     <w:p>
@@ -1127,200 +1128,7 @@
         <w:t>t</w:t>
       </w:r>
     </w:p>
-    <w:p>
-      <w:r>
-        <w:rPr>
-          <w:noProof/>
-        </w:rPr>
-        <mc:AlternateContent>
-          <mc:Choice Requires="wps">
-            <w:drawing>
-              <wp:anchor distT="45720" distB="45720" distL="114300" distR="114300" simplePos="0" relativeHeight="251671552" behindDoc="0" locked="0" layoutInCell="1" allowOverlap="1" wp14:anchorId="56369EEE" wp14:editId="7A0FC799">
-                <wp:simplePos x="0" y="0"/>
-                <wp:positionH relativeFrom="margin">
-                  <wp:posOffset>1807527</wp:posOffset>
-                </wp:positionH>
-                <wp:positionV relativeFrom="page">
-                  <wp:posOffset>4144645</wp:posOffset>
-                </wp:positionV>
-                <wp:extent cx="1801261" cy="976630"/>
-                <wp:effectExtent l="38100" t="171450" r="27940" b="181610"/>
-                <wp:wrapNone/>
-                <wp:docPr id="116962023" name="Text Box 2"/>
-                <wp:cNvGraphicFramePr>
-                  <a:graphicFrameLocks xmlns:a="http://schemas.openxmlformats.org/drawingml/2006/main"/>
-                </wp:cNvGraphicFramePr>
-                <a:graphic xmlns:a="http://schemas.openxmlformats.org/drawingml/2006/main">
-                  <a:graphicData uri="http://schemas.microsoft.com/office/word/2010/wordprocessingShape">
-                    <wps:wsp>
-                      <wps:cNvSpPr txBox="1">
-                        <a:spLocks noChangeArrowheads="1"/>
-                      </wps:cNvSpPr>
-                      <wps:spPr bwMode="auto">
-                        <a:xfrm rot="20976019">
-                          <a:off x="0" y="0"/>
-                          <a:ext cx="1801261" cy="976630"/>
-                        </a:xfrm>
-                        <a:prstGeom prst="rect">
-                          <a:avLst/>
-                        </a:prstGeom>
-                        <a:solidFill>
-                          <a:srgbClr val="FFFFFF"/>
-                        </a:solidFill>
-                        <a:ln w="9525">
-                          <a:solidFill>
-                            <a:srgbClr val="000000"/>
-                          </a:solidFill>
-                          <a:miter lim="800000"/>
-                          <a:headEnd/>
-                          <a:tailEnd/>
-                        </a:ln>
-                      </wps:spPr>
-                      <wps:txbx>
-                        <w:txbxContent>
-                          <w:p>
-                            <w:pPr>
-                              <w:jc w:val="center"/>
-                            </w:pPr>
-                            <w:r>
-                              <w:t>Production Area</w:t>
-                            </w:r>
-                          </w:p>
-                        </w:txbxContent>
-                      </wps:txbx>
-                      <wps:bodyPr rot="0" vert="horz" wrap="square" lIns="91440" tIns="45720" rIns="91440" bIns="45720" anchor="t" anchorCtr="0">
-                        <a:spAutoFit/>
-                      </wps:bodyPr>
-                    </wps:wsp>
-                  </a:graphicData>
-                </a:graphic>
-                <wp14:sizeRelH relativeFrom="margin">
-                  <wp14:pctWidth>0</wp14:pctWidth>
-                </wp14:sizeRelH>
-                <wp14:sizeRelV relativeFrom="margin">
-                  <wp14:pctHeight>0</wp14:pctHeight>
-                </wp14:sizeRelV>
-              </wp:anchor>
-            </w:drawing>
-          </mc:Choice>
-          <mc:Fallback>
-            <w:pict>
-              <v:shape w14:anchorId="56369EEE" id="_x0000_s1031" type="#_x0000_t202" style="position:absolute;margin-left:142.3pt;margin-top:326.35pt;width:141.85pt;height:76.9pt;rotation:-681554fd;z-index:251671552;visibility:visible;mso-wrap-style:square;mso-width-percent:0;mso-height-percent:0;mso-wrap-distance-left:9pt;mso-wrap-distance-top:3.6pt;mso-wrap-distance-right:9pt;mso-wrap-distance-bottom:3.6pt;mso-position-horizontal:absolute;mso-position-horizontal-relative:margin;mso-position-vertical:absolute;mso-position-vertical-relative:page;mso-width-percent:0;mso-height-percent:0;mso-width-relative:margin;mso-height-relative:margin;v-text-anchor:top" o:gfxdata="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">
-                <v:textbox style="mso-fit-shape-to-text:t">
-                  <w:txbxContent>
-                    <w:p>
-                      <w:pPr>
-                        <w:jc w:val="center"/>
-                      </w:pPr>
-                      <w:r>
-                        <w:t>Production Area</w:t>
-                      </w:r>
-                    </w:p>
-                  </w:txbxContent>
-                </v:textbox>
-                <w10:wrap anchorx="margin" anchory="page"/>
-              </v:shape>
-            </w:pict>
-          </mc:Fallback>
-        </mc:AlternateContent>
-      </w:r>
-      <w:r>
-        <w:rPr>
-          <w:noProof/>
-        </w:rPr>
-        <mc:AlternateContent>
-          <mc:Choice Requires="wps">
-            <w:drawing>
-              <wp:anchor distT="45720" distB="45720" distL="114300" distR="114300" simplePos="0" relativeHeight="251669504" behindDoc="0" locked="0" layoutInCell="1" allowOverlap="1" wp14:anchorId="05916103" wp14:editId="7FC7F626">
-                <wp:simplePos x="0" y="0"/>
-                <wp:positionH relativeFrom="margin">
-                  <wp:posOffset>4285932</wp:posOffset>
-                </wp:positionH>
-                <wp:positionV relativeFrom="page">
-                  <wp:posOffset>5288597</wp:posOffset>
-                </wp:positionV>
-                <wp:extent cx="641254" cy="976630"/>
-                <wp:effectExtent l="38100" t="76200" r="45085" b="67310"/>
-                <wp:wrapNone/>
-                <wp:docPr id="622685211" name="Text Box 2"/>
-                <wp:cNvGraphicFramePr>
-                  <a:graphicFrameLocks xmlns:a="http://schemas.openxmlformats.org/drawingml/2006/main"/>
-                </wp:cNvGraphicFramePr>
-                <a:graphic xmlns:a="http://schemas.openxmlformats.org/drawingml/2006/main">
-                  <a:graphicData uri="http://schemas.microsoft.com/office/word/2010/wordprocessingShape">
-                    <wps:wsp>
-                      <wps:cNvSpPr txBox="1">
-                        <a:spLocks noChangeArrowheads="1"/>
-                      </wps:cNvSpPr>
-                      <wps:spPr bwMode="auto">
-                        <a:xfrm rot="20976019">
-                          <a:off x="0" y="0"/>
-                          <a:ext cx="641254" cy="976630"/>
-                        </a:xfrm>
-                        <a:prstGeom prst="rect">
-                          <a:avLst/>
-                        </a:prstGeom>
-                        <a:solidFill>
-                          <a:srgbClr val="FFFFFF"/>
-                        </a:solidFill>
-                        <a:ln w="9525">
-                          <a:solidFill>
-                            <a:srgbClr val="000000"/>
-                          </a:solidFill>
-                          <a:miter lim="800000"/>
-                          <a:headEnd/>
-                          <a:tailEnd/>
-                        </a:ln>
-                      </wps:spPr>
-                      <wps:txbx>
-                        <w:txbxContent>
-                          <w:p>
-                            <w:pPr>
-                              <w:jc w:val="center"/>
-                            </w:pPr>
-                            <w:r>
-                              <w:t>Office</w:t>
-                            </w:r>
-                          </w:p>
-                        </w:txbxContent>
-                      </wps:txbx>
-                      <wps:bodyPr rot="0" vert="horz" wrap="square" lIns="91440" tIns="45720" rIns="91440" bIns="45720" anchor="t" anchorCtr="0">
-                        <a:spAutoFit/>
-                      </wps:bodyPr>
-                    </wps:wsp>
-                  </a:graphicData>
-                </a:graphic>
-                <wp14:sizeRelH relativeFrom="margin">
-                  <wp14:pctWidth>0</wp14:pctWidth>
-                </wp14:sizeRelH>
-                <wp14:sizeRelV relativeFrom="margin">
-                  <wp14:pctHeight>0</wp14:pctHeight>
-                </wp14:sizeRelV>
-              </wp:anchor>
-            </w:drawing>
-          </mc:Choice>
-          <mc:Fallback>
-            <w:pict>
-              <v:shape w14:anchorId="05916103" id="_x0000_s1032" type="#_x0000_t202" style="position:absolute;margin-left:337.45pt;margin-top:416.4pt;width:50.5pt;height:76.9pt;rotation:-681554fd;z-index:251669504;visibility:visible;mso-wrap-style:square;mso-width-percent:0;mso-height-percent:0;mso-wrap-distance-left:9pt;mso-wrap-distance-top:3.6pt;mso-wrap-distance-right:9pt;mso-wrap-distance-bottom:3.6pt;mso-position-horizontal:absolute;mso-position-horizontal-relative:margin;mso-position-vertical:absolute;mso-position-vertical-relative:page;mso-width-percent:0;mso-height-percent:0;mso-width-relative:margin;mso-height-relative:margin;v-text-anchor:top" o:gfxdata="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">
-                <v:textbox style="mso-fit-shape-to-text:t">
-                  <w:txbxContent>
-                    <w:p>
-                      <w:pPr>
-                        <w:jc w:val="center"/>
-                      </w:pPr>
-                      <w:r>
-                        <w:t>Office</w:t>
-                      </w:r>
-                    </w:p>
-                  </w:txbxContent>
-                </v:textbox>
-                <w10:wrap anchorx="margin" anchory="page"/>
-              </v:shape>
-            </w:pict>
-          </mc:Fallback>
-        </mc:AlternateContent>
-      </w:r>
-    </w:p>
+    <w:p/>
     <w:sectPr>
       <w:footerReference w:type="default" r:id="rId13"/>
       <w:pgSz w:w="12240" w:h="15840"/>
@@ -4298,7 +4106,7 @@
     <w:autoRedefine/>
     <w:uiPriority w:val="9"/>
     <w:qFormat/>
-    <w:rsid w:val="00667A23"/>
+    <w:rsid w:val="00BC7795"/>
     <w:pPr>
       <w:keepNext/>
       <w:spacing w:before="120" w:line="360" w:lineRule="auto"/>
@@ -4307,7 +4115,6 @@
     </w:pPr>
     <w:rPr>
       <w:b/>
-      <w:caps/>
     </w:rPr>
   </w:style>
   <w:style w:type="paragraph" w:styleId="Heading2">
@@ -4402,7 +4209,6 @@
   <w:style w:type="character" w:default="1" w:styleId="DefaultParagraphFont">
     <w:name w:val="Default Paragraph Font"/>
     <w:uiPriority w:val="1"/>
-    <w:semiHidden/>
     <w:unhideWhenUsed/>
   </w:style>
   <w:style w:type="table" w:default="1" w:styleId="TableNormal">

</xml_diff>